<commit_message>
Deploying to gh-pages from @ Morrison-Lab/vds@d73cd5bdb04f9345e5158267cab7d7e9a8a8e6f0 🚀
</commit_message>
<xml_diff>
--- a/index.docx
+++ b/index.docx
@@ -7,7 +7,7 @@
         <w:pStyle w:val="Title"/>
       </w:pPr>
       <w:r>
-        <w:t xml:space="preserve">Quarto Website Template</w:t>
+        <w:t xml:space="preserve">Visualization Notes</w:t>
       </w:r>
     </w:p>
     <w:p>
@@ -15,10 +15,10 @@
         <w:pStyle w:val="Date"/>
       </w:pPr>
       <w:r>
-        <w:t xml:space="preserve">Last modified: 2026-10-19 02:16:46 (PDT)</w:t>
+        <w:t xml:space="preserve">Last modified: 2026-10-19 03:20:06 (PDT)</w:t>
       </w:r>
     </w:p>
-    <w:bookmarkStart w:id="17" w:name="welcome"/>
+    <w:bookmarkStart w:id="14" w:name="welcome"/>
     <w:p>
       <w:pPr>
         <w:pStyle w:val="Heading1"/>
@@ -32,15 +32,28 @@
         <w:pStyle w:val="FirstParagraph"/>
       </w:pPr>
       <w:r>
-        <w:t xml:space="preserve">This is a Quarto website template that you can use to create your own website.</w:t>
+        <w:t xml:space="preserve">These notes cover how to visualize data.</w:t>
+      </w:r>
+      <w:r>
+        <w:t xml:space="preserve"> </w:t>
+      </w:r>
+      <w:r>
+        <w:t xml:space="preserve">Each page works through one plot, with R and Python code side by side.</w:t>
+      </w:r>
+      <w:r>
+        <w:t xml:space="preserve"> </w:t>
+      </w:r>
+      <w:r>
+        <w:t xml:space="preserve">The code runs when the site is built, so every figure comes from the data shown.</w:t>
       </w:r>
     </w:p>
+    <w:bookmarkStart w:id="10" w:name="pages"/>
     <w:p>
       <w:pPr>
-        <w:pStyle w:val="BodyText"/>
-      </w:pPr>
-      <w:r>
-        <w:t xml:space="preserve">The notes are available in multiple formats:</w:t>
+        <w:pStyle w:val="Heading2"/>
+      </w:pPr>
+      <w:r>
+        <w:t xml:space="preserve">0.1 Pages</w:t>
       </w:r>
     </w:p>
     <w:p>
@@ -51,158 +64,26 @@
           <w:numId w:val="1001"/>
         </w:numPr>
       </w:pPr>
-      <w:r>
-        <w:rPr>
-          <w:b/>
-          <w:bCs/>
-        </w:rPr>
-        <w:t xml:space="preserve">HTML Website</w:t>
-      </w:r>
-      <w:r>
-        <w:t xml:space="preserve">: Navigate using the navbar for easy access to all pages</w:t>
-      </w:r>
-    </w:p>
-    <w:p>
-      <w:pPr>
-        <w:pStyle w:val="Compact"/>
-        <w:numPr>
-          <w:ilvl w:val="0"/>
-          <w:numId w:val="1001"/>
-        </w:numPr>
-      </w:pPr>
-      <w:r>
-        <w:rPr>
-          <w:b/>
-          <w:bCs/>
-        </w:rPr>
-        <w:t xml:space="preserve">RevealJS Slides</w:t>
-      </w:r>
-      <w:r>
-        <w:t xml:space="preserve">: Each chapter can generate a presentation format with</w:t>
-      </w:r>
-      <w:r>
-        <w:t xml:space="preserve"> </w:t>
-      </w:r>
-      <w:r>
-        <w:rPr>
-          <w:rStyle w:val="VerbatimChar"/>
-        </w:rPr>
-        <w:t xml:space="preserve">-slides.html</w:t>
-      </w:r>
-      <w:r>
-        <w:t xml:space="preserve"> </w:t>
-      </w:r>
-      <w:r>
-        <w:t xml:space="preserve">suffix</w:t>
-      </w:r>
-    </w:p>
-    <w:p>
-      <w:pPr>
-        <w:pStyle w:val="Compact"/>
-        <w:numPr>
-          <w:ilvl w:val="0"/>
-          <w:numId w:val="1001"/>
-        </w:numPr>
-      </w:pPr>
-      <w:r>
-        <w:rPr>
-          <w:b/>
-          <w:bCs/>
-        </w:rPr>
-        <w:t xml:space="preserve">PDF Handouts</w:t>
-      </w:r>
-      <w:r>
-        <w:t xml:space="preserve">: Each chapter can generate a PDF handout with</w:t>
-      </w:r>
-      <w:r>
-        <w:t xml:space="preserve"> </w:t>
-      </w:r>
-      <w:r>
-        <w:rPr>
-          <w:rStyle w:val="VerbatimChar"/>
-        </w:rPr>
-        <w:t xml:space="preserve">-handout.pdf</w:t>
-      </w:r>
-      <w:r>
-        <w:t xml:space="preserve"> </w:t>
-      </w:r>
-      <w:r>
-        <w:t xml:space="preserve">suffix</w:t>
-      </w:r>
-    </w:p>
-    <w:p>
-      <w:pPr>
-        <w:pStyle w:val="Compact"/>
-        <w:numPr>
-          <w:ilvl w:val="0"/>
-          <w:numId w:val="1001"/>
-        </w:numPr>
-      </w:pPr>
-      <w:r>
-        <w:rPr>
-          <w:b/>
-          <w:bCs/>
-        </w:rPr>
-        <w:t xml:space="preserve">DOCX Documents</w:t>
-      </w:r>
-      <w:r>
-        <w:t xml:space="preserve">: Each chapter can generate a Microsoft Word document with</w:t>
-      </w:r>
-      <w:r>
-        <w:t xml:space="preserve"> </w:t>
-      </w:r>
-      <w:r>
-        <w:rPr>
-          <w:rStyle w:val="VerbatimChar"/>
-        </w:rPr>
-        <w:t xml:space="preserve">.docx</w:t>
-      </w:r>
-      <w:r>
-        <w:t xml:space="preserve"> </w:t>
-      </w:r>
-      <w:r>
-        <w:t xml:space="preserve">extension</w:t>
-      </w:r>
-    </w:p>
-    <w:bookmarkStart w:id="10" w:name="about-this-website"/>
-    <w:p>
-      <w:pPr>
-        <w:pStyle w:val="Heading2"/>
-      </w:pPr>
-      <w:r>
-        <w:t xml:space="preserve">0.1 About this website</w:t>
-      </w:r>
-    </w:p>
-    <w:p>
-      <w:pPr>
-        <w:pStyle w:val="FirstParagraph"/>
-      </w:pPr>
-      <w:r>
-        <w:t xml:space="preserve">This website is built with</w:t>
-      </w:r>
-      <w:r>
-        <w:t xml:space="preserve"> </w:t>
-      </w:r>
       <w:hyperlink r:id="rId9">
         <w:r>
           <w:rPr>
             <w:rStyle w:val="Hyperlink"/>
           </w:rPr>
-          <w:t xml:space="preserve">Quarto</w:t>
+          <w:t xml:space="preserve">Plotting a Binary Outcome</w:t>
         </w:r>
       </w:hyperlink>
       <w:r>
-        <w:t xml:space="preserve">, an open-source scientific and technical publishing system. You can use Quarto to create books, websites, blogs, presentations, and more from markdown files.</w:t>
+        <w:t xml:space="preserve">: a rug and two histograms for a 0/1 outcome and a continuous feature.</w:t>
       </w:r>
     </w:p>
     <w:bookmarkEnd w:id="10"/>
-    <w:bookmarkStart w:id="11" w:name="getting-started"/>
+    <w:bookmarkStart w:id="11" w:name="formats"/>
     <w:p>
       <w:pPr>
         <w:pStyle w:val="Heading2"/>
       </w:pPr>
       <w:r>
-        <w:t xml:space="preserve">0.2 Getting Started</w:t>
+        <w:t xml:space="preserve">0.2 Formats</w:t>
       </w:r>
     </w:p>
     <w:p>
@@ -210,58 +91,31 @@
         <w:pStyle w:val="FirstParagraph"/>
       </w:pPr>
       <w:r>
-        <w:t xml:space="preserve">To use this template:</w:t>
+        <w:t xml:space="preserve">Each page is available in these formats:</w:t>
       </w:r>
     </w:p>
     <w:p>
       <w:pPr>
+        <w:pStyle w:val="Compact"/>
         <w:numPr>
           <w:ilvl w:val="0"/>
           <w:numId w:val="1002"/>
         </w:numPr>
       </w:pPr>
       <w:r>
-        <w:rPr>
-          <w:b/>
-          <w:bCs/>
-        </w:rPr>
-        <w:t xml:space="preserve">Update the configuration</w:t>
-      </w:r>
-      <w:r>
-        <w:t xml:space="preserve">: Edit</w:t>
-      </w:r>
-      <w:r>
-        <w:t xml:space="preserve"> </w:t>
-      </w:r>
-      <w:r>
-        <w:rPr>
-          <w:rStyle w:val="VerbatimChar"/>
-        </w:rPr>
-        <w:t xml:space="preserve">_quarto-website.yml</w:t>
-      </w:r>
-      <w:r>
-        <w:t xml:space="preserve"> </w:t>
-      </w:r>
-      <w:r>
-        <w:t xml:space="preserve">to change the website title, site URL, and navigation menu.</w:t>
+        <w:t xml:space="preserve">an HTML web page;</w:t>
       </w:r>
     </w:p>
     <w:p>
       <w:pPr>
+        <w:pStyle w:val="Compact"/>
         <w:numPr>
           <w:ilvl w:val="0"/>
           <w:numId w:val="1002"/>
         </w:numPr>
       </w:pPr>
       <w:r>
-        <w:rPr>
-          <w:b/>
-          <w:bCs/>
-        </w:rPr>
-        <w:t xml:space="preserve">Add your content</w:t>
-      </w:r>
-      <w:r>
-        <w:t xml:space="preserve">: Create new</w:t>
+        <w:t xml:space="preserve">RevealJS slides, at the same address with</w:t>
       </w:r>
       <w:r>
         <w:t xml:space="preserve"> </w:t>
@@ -270,341 +124,41 @@
         <w:rPr>
           <w:rStyle w:val="VerbatimChar"/>
         </w:rPr>
-        <w:t xml:space="preserve">.qmd</w:t>
+        <w:t xml:space="preserve">-slides</w:t>
       </w:r>
       <w:r>
         <w:t xml:space="preserve"> </w:t>
       </w:r>
       <w:r>
-        <w:t xml:space="preserve">files for each page and add them to the navigation menu and the sidebar in</w:t>
-      </w:r>
-      <w:r>
-        <w:t xml:space="preserve"> </w:t>
-      </w:r>
-      <w:r>
-        <w:rPr>
-          <w:rStyle w:val="VerbatimChar"/>
-        </w:rPr>
-        <w:t xml:space="preserve">_quarto-website.yml</w:t>
-      </w:r>
-      <w:r>
-        <w:t xml:space="preserve"> </w:t>
-      </w:r>
-      <w:r>
-        <w:t xml:space="preserve">(the sidebar order sets the previous/next page links).</w:t>
+        <w:t xml:space="preserve">added to the page name;</w:t>
       </w:r>
     </w:p>
     <w:p>
       <w:pPr>
+        <w:pStyle w:val="Compact"/>
         <w:numPr>
           <w:ilvl w:val="0"/>
           <w:numId w:val="1002"/>
         </w:numPr>
       </w:pPr>
       <w:r>
-        <w:rPr>
-          <w:b/>
-          <w:bCs/>
-        </w:rPr>
-        <w:t xml:space="preserve">Customize the style</w:t>
-      </w:r>
-      <w:r>
-        <w:t xml:space="preserve">: Modify</w:t>
-      </w:r>
-      <w:r>
-        <w:t xml:space="preserve"> </w:t>
-      </w:r>
-      <w:r>
-        <w:rPr>
-          <w:rStyle w:val="VerbatimChar"/>
-        </w:rPr>
-        <w:t xml:space="preserve">styles.css</w:t>
-      </w:r>
-      <w:r>
-        <w:t xml:space="preserve"> </w:t>
-      </w:r>
-      <w:r>
-        <w:t xml:space="preserve">to change the appearance of your website.</w:t>
-      </w:r>
-    </w:p>
-    <w:p>
-      <w:pPr>
-        <w:numPr>
-          <w:ilvl w:val="0"/>
-          <w:numId w:val="1002"/>
-        </w:numPr>
-      </w:pPr>
-      <w:r>
-        <w:rPr>
-          <w:b/>
-          <w:bCs/>
-        </w:rPr>
-        <w:t xml:space="preserve">Add references</w:t>
-      </w:r>
-      <w:r>
-        <w:t xml:space="preserve">: Update</w:t>
-      </w:r>
-      <w:r>
-        <w:t xml:space="preserve"> </w:t>
-      </w:r>
-      <w:r>
-        <w:rPr>
-          <w:rStyle w:val="VerbatimChar"/>
-        </w:rPr>
-        <w:t xml:space="preserve">references.bib</w:t>
-      </w:r>
-      <w:r>
-        <w:t xml:space="preserve"> </w:t>
-      </w:r>
-      <w:r>
-        <w:t xml:space="preserve">with your citations.</w:t>
+        <w:t xml:space="preserve">a PDF handout and a Word document.</w:t>
       </w:r>
     </w:p>
     <w:bookmarkEnd w:id="11"/>
-    <w:bookmarkStart w:id="12" w:name="building-the-website"/>
+    <w:bookmarkStart w:id="13" w:name="references"/>
     <w:p>
       <w:pPr>
         <w:pStyle w:val="Heading2"/>
       </w:pPr>
       <w:r>
-        <w:t xml:space="preserve">0.3 Building the website</w:t>
+        <w:t xml:space="preserve">References</w:t>
       </w:r>
     </w:p>
-    <w:p>
-      <w:pPr>
-        <w:pStyle w:val="FirstParagraph"/>
-      </w:pPr>
-      <w:r>
-        <w:t xml:space="preserve">To render the website locally:</w:t>
-      </w:r>
-    </w:p>
-    <w:p>
-      <w:pPr>
-        <w:pStyle w:val="SourceCode"/>
-      </w:pPr>
-      <w:r>
-        <w:rPr>
-          <w:rStyle w:val="ExtensionTok"/>
-        </w:rPr>
-        <w:t xml:space="preserve">quarto</w:t>
-      </w:r>
-      <w:r>
-        <w:rPr>
-          <w:rStyle w:val="NormalTok"/>
-        </w:rPr>
-        <w:t xml:space="preserve"> render</w:t>
-      </w:r>
-    </w:p>
-    <w:p>
-      <w:pPr>
-        <w:pStyle w:val="FirstParagraph"/>
-      </w:pPr>
-      <w:r>
-        <w:t xml:space="preserve">To preview the website with live reload:</w:t>
-      </w:r>
-    </w:p>
-    <w:p>
-      <w:pPr>
-        <w:pStyle w:val="SourceCode"/>
-      </w:pPr>
-      <w:r>
-        <w:rPr>
-          <w:rStyle w:val="ExtensionTok"/>
-        </w:rPr>
-        <w:t xml:space="preserve">quarto</w:t>
-      </w:r>
-      <w:r>
-        <w:rPr>
-          <w:rStyle w:val="NormalTok"/>
-        </w:rPr>
-        <w:t xml:space="preserve"> preview</w:t>
-      </w:r>
-    </w:p>
-    <w:p>
-      <w:pPr>
-        <w:pStyle w:val="FirstParagraph"/>
-      </w:pPr>
-      <w:r>
-        <w:t xml:space="preserve">The rendered output will be in the</w:t>
-      </w:r>
-      <w:r>
-        <w:t xml:space="preserve"> </w:t>
-      </w:r>
-      <w:r>
-        <w:rPr>
-          <w:rStyle w:val="VerbatimChar"/>
-        </w:rPr>
-        <w:t xml:space="preserve">_site/</w:t>
-      </w:r>
-      <w:r>
-        <w:t xml:space="preserve"> </w:t>
-      </w:r>
-      <w:r>
-        <w:t xml:space="preserve">directory, which can be published to GitHub Pages.</w:t>
-      </w:r>
-    </w:p>
+    <w:bookmarkStart w:id="12" w:name="refs"/>
     <w:bookmarkEnd w:id="12"/>
-    <w:bookmarkStart w:id="13" w:name="publishing-to-github-pages"/>
-    <w:p>
-      <w:pPr>
-        <w:pStyle w:val="Heading2"/>
-      </w:pPr>
-      <w:r>
-        <w:t xml:space="preserve">0.4 Publishing to GitHub Pages</w:t>
-      </w:r>
-    </w:p>
-    <w:p>
-      <w:pPr>
-        <w:pStyle w:val="FirstParagraph"/>
-      </w:pPr>
-      <w:r>
-        <w:t xml:space="preserve">This template includes a GitHub Actions workflow that automatically builds and publishes your website to GitHub Pages when you push to the main branch.</w:t>
-      </w:r>
-    </w:p>
-    <w:p>
-      <w:pPr>
-        <w:pStyle w:val="BodyText"/>
-      </w:pPr>
-      <w:r>
-        <w:t xml:space="preserve">To enable GitHub Pages:</w:t>
-      </w:r>
-    </w:p>
-    <w:p>
-      <w:pPr>
-        <w:pStyle w:val="Compact"/>
-        <w:numPr>
-          <w:ilvl w:val="0"/>
-          <w:numId w:val="1003"/>
-        </w:numPr>
-      </w:pPr>
-      <w:r>
-        <w:t xml:space="preserve">Go to your repository settings</w:t>
-      </w:r>
-    </w:p>
-    <w:p>
-      <w:pPr>
-        <w:pStyle w:val="Compact"/>
-        <w:numPr>
-          <w:ilvl w:val="0"/>
-          <w:numId w:val="1003"/>
-        </w:numPr>
-      </w:pPr>
-      <w:r>
-        <w:t xml:space="preserve">Navigate to</w:t>
-      </w:r>
-      <w:r>
-        <w:t xml:space="preserve"> </w:t>
-      </w:r>
-      <w:r>
-        <w:t xml:space="preserve">“Pages”</w:t>
-      </w:r>
-      <w:r>
-        <w:t xml:space="preserve"> </w:t>
-      </w:r>
-      <w:r>
-        <w:t xml:space="preserve">in the left sidebar</w:t>
-      </w:r>
-    </w:p>
-    <w:p>
-      <w:pPr>
-        <w:pStyle w:val="Compact"/>
-        <w:numPr>
-          <w:ilvl w:val="0"/>
-          <w:numId w:val="1003"/>
-        </w:numPr>
-      </w:pPr>
-      <w:r>
-        <w:t xml:space="preserve">Under</w:t>
-      </w:r>
-      <w:r>
-        <w:t xml:space="preserve"> </w:t>
-      </w:r>
-      <w:r>
-        <w:t xml:space="preserve">“Build and deployment”</w:t>
-      </w:r>
-      <w:r>
-        <w:t xml:space="preserve">, set Source to</w:t>
-      </w:r>
-      <w:r>
-        <w:t xml:space="preserve"> </w:t>
-      </w:r>
-      <w:r>
-        <w:t xml:space="preserve">“GitHub Actions”</w:t>
-      </w:r>
-    </w:p>
-    <w:p>
-      <w:pPr>
-        <w:pStyle w:val="Compact"/>
-        <w:numPr>
-          <w:ilvl w:val="0"/>
-          <w:numId w:val="1003"/>
-        </w:numPr>
-      </w:pPr>
-      <w:r>
-        <w:t xml:space="preserve">Push your changes to the main branch</w:t>
-      </w:r>
-    </w:p>
-    <w:p>
-      <w:pPr>
-        <w:pStyle w:val="Compact"/>
-        <w:numPr>
-          <w:ilvl w:val="0"/>
-          <w:numId w:val="1003"/>
-        </w:numPr>
-      </w:pPr>
-      <w:r>
-        <w:t xml:space="preserve">The workflow will automatically build and deploy your website</w:t>
-      </w:r>
-    </w:p>
-    <w:p>
-      <w:pPr>
-        <w:pStyle w:val="FirstParagraph"/>
-      </w:pPr>
-      <w:r>
-        <w:t xml:space="preserve">Your website will be available at</w:t>
-      </w:r>
-      <w:r>
-        <w:t xml:space="preserve"> </w:t>
-      </w:r>
-      <w:r>
-        <w:rPr>
-          <w:rStyle w:val="VerbatimChar"/>
-        </w:rPr>
-        <w:t xml:space="preserve">https://YOUR-USERNAME.github.io/YOUR-REPO/</w:t>
-      </w:r>
-    </w:p>
     <w:bookmarkEnd w:id="13"/>
-    <w:bookmarkStart w:id="14" w:name="license"/>
-    <w:p>
-      <w:pPr>
-        <w:pStyle w:val="Heading2"/>
-      </w:pPr>
-      <w:r>
-        <w:t xml:space="preserve">0.5 License</w:t>
-      </w:r>
-    </w:p>
-    <w:p>
-      <w:pPr>
-        <w:pStyle w:val="FirstParagraph"/>
-      </w:pPr>
-      <w:r>
-        <w:t xml:space="preserve">Add your license information here.</w:t>
-      </w:r>
-    </w:p>
     <w:bookmarkEnd w:id="14"/>
-    <w:bookmarkStart w:id="16" w:name="references"/>
-    <w:p>
-      <w:pPr>
-        <w:pStyle w:val="Heading2"/>
-      </w:pPr>
-      <w:r>
-        <w:t xml:space="preserve">References</w:t>
-      </w:r>
-    </w:p>
-    <w:bookmarkStart w:id="15" w:name="refs"/>
-    <w:bookmarkEnd w:id="15"/>
-    <w:bookmarkEnd w:id="16"/>
-    <w:bookmarkEnd w:id="17"/>
     <w:sectPr>
       <w:footnotePr>
         <w:numRestart w:val="eachSect"/>
@@ -818,91 +372,6 @@
       </w:rPr>
     </w:lvl>
   </w:abstractNum>
-  <w:abstractNum w:abstractNumId="99411">
-    <w:nsid w:val="00A99411"/>
-    <w:multiLevelType w:val="multilevel"/>
-    <w:lvl w:ilvl="0">
-      <w:start w:val="1"/>
-      <w:numFmt w:val="decimal"/>
-      <w:lvlText w:val="%1."/>
-      <w:lvlJc w:val="left"/>
-      <w:pPr>
-        <w:ind w:left="720" w:hanging="360"/>
-      </w:pPr>
-    </w:lvl>
-    <w:lvl w:ilvl="1">
-      <w:start w:val="1"/>
-      <w:numFmt w:val="decimal"/>
-      <w:lvlText w:val="%2."/>
-      <w:lvlJc w:val="left"/>
-      <w:pPr>
-        <w:ind w:left="1440" w:hanging="360"/>
-      </w:pPr>
-    </w:lvl>
-    <w:lvl w:ilvl="2">
-      <w:start w:val="1"/>
-      <w:numFmt w:val="decimal"/>
-      <w:lvlText w:val="%3."/>
-      <w:lvlJc w:val="left"/>
-      <w:pPr>
-        <w:ind w:left="2160" w:hanging="360"/>
-      </w:pPr>
-    </w:lvl>
-    <w:lvl w:ilvl="3">
-      <w:start w:val="1"/>
-      <w:numFmt w:val="decimal"/>
-      <w:lvlText w:val="%4."/>
-      <w:lvlJc w:val="left"/>
-      <w:pPr>
-        <w:ind w:left="2880" w:hanging="360"/>
-      </w:pPr>
-    </w:lvl>
-    <w:lvl w:ilvl="4">
-      <w:start w:val="1"/>
-      <w:numFmt w:val="decimal"/>
-      <w:lvlText w:val="%5."/>
-      <w:lvlJc w:val="left"/>
-      <w:pPr>
-        <w:ind w:left="3600" w:hanging="360"/>
-      </w:pPr>
-    </w:lvl>
-    <w:lvl w:ilvl="5">
-      <w:start w:val="1"/>
-      <w:numFmt w:val="decimal"/>
-      <w:lvlText w:val="%6."/>
-      <w:lvlJc w:val="left"/>
-      <w:pPr>
-        <w:ind w:left="4320" w:hanging="360"/>
-      </w:pPr>
-    </w:lvl>
-    <w:lvl w:ilvl="6">
-      <w:start w:val="1"/>
-      <w:numFmt w:val="decimal"/>
-      <w:lvlText w:val="%7."/>
-      <w:lvlJc w:val="left"/>
-      <w:pPr>
-        <w:ind w:left="5040" w:hanging="360"/>
-      </w:pPr>
-    </w:lvl>
-    <w:lvl w:ilvl="7">
-      <w:start w:val="1"/>
-      <w:numFmt w:val="decimal"/>
-      <w:lvlText w:val="%8."/>
-      <w:lvlJc w:val="left"/>
-      <w:pPr>
-        <w:ind w:left="5760" w:hanging="360"/>
-      </w:pPr>
-    </w:lvl>
-    <w:lvl w:ilvl="8">
-      <w:start w:val="1"/>
-      <w:numFmt w:val="decimal"/>
-      <w:lvlText w:val="%9."/>
-      <w:lvlJc w:val="left"/>
-      <w:pPr>
-        <w:ind w:left="6480" w:hanging="360"/>
-      </w:pPr>
-    </w:lvl>
-  </w:abstractNum>
   <w:num w:numId="1000">
     <w:abstractNumId w:val="990"/>
   </w:num>
@@ -910,64 +379,7 @@
     <w:abstractNumId w:val="991"/>
   </w:num>
   <w:num w:numId="1002">
-    <w:abstractNumId w:val="99411"/>
-    <w:lvlOverride w:ilvl="0">
-      <w:startOverride w:val="1"/>
-    </w:lvlOverride>
-    <w:lvlOverride w:ilvl="1">
-      <w:startOverride w:val="1"/>
-    </w:lvlOverride>
-    <w:lvlOverride w:ilvl="2">
-      <w:startOverride w:val="1"/>
-    </w:lvlOverride>
-    <w:lvlOverride w:ilvl="3">
-      <w:startOverride w:val="1"/>
-    </w:lvlOverride>
-    <w:lvlOverride w:ilvl="4">
-      <w:startOverride w:val="1"/>
-    </w:lvlOverride>
-    <w:lvlOverride w:ilvl="5">
-      <w:startOverride w:val="1"/>
-    </w:lvlOverride>
-    <w:lvlOverride w:ilvl="6">
-      <w:startOverride w:val="1"/>
-    </w:lvlOverride>
-    <w:lvlOverride w:ilvl="7">
-      <w:startOverride w:val="1"/>
-    </w:lvlOverride>
-    <w:lvlOverride w:ilvl="8">
-      <w:startOverride w:val="1"/>
-    </w:lvlOverride>
-  </w:num>
-  <w:num w:numId="1003">
-    <w:abstractNumId w:val="99411"/>
-    <w:lvlOverride w:ilvl="0">
-      <w:startOverride w:val="1"/>
-    </w:lvlOverride>
-    <w:lvlOverride w:ilvl="1">
-      <w:startOverride w:val="1"/>
-    </w:lvlOverride>
-    <w:lvlOverride w:ilvl="2">
-      <w:startOverride w:val="1"/>
-    </w:lvlOverride>
-    <w:lvlOverride w:ilvl="3">
-      <w:startOverride w:val="1"/>
-    </w:lvlOverride>
-    <w:lvlOverride w:ilvl="4">
-      <w:startOverride w:val="1"/>
-    </w:lvlOverride>
-    <w:lvlOverride w:ilvl="5">
-      <w:startOverride w:val="1"/>
-    </w:lvlOverride>
-    <w:lvlOverride w:ilvl="6">
-      <w:startOverride w:val="1"/>
-    </w:lvlOverride>
-    <w:lvlOverride w:ilvl="7">
-      <w:startOverride w:val="1"/>
-    </w:lvlOverride>
-    <w:lvlOverride w:ilvl="8">
-      <w:startOverride w:val="1"/>
-    </w:lvlOverride>
+    <w:abstractNumId w:val="991"/>
   </w:num>
 </w:numbering>
 </file>

</xml_diff>

<commit_message>
Deploying to gh-pages from @ Morrison-Lab/vds@c4afefd643aed5cad4874eed11ab19effa7279ce 🚀
</commit_message>
<xml_diff>
--- a/index.docx
+++ b/index.docx
@@ -15,10 +15,10 @@
         <w:pStyle w:val="Date"/>
       </w:pPr>
       <w:r>
-        <w:t xml:space="preserve">Last modified: 2026-10-22 16:10:14 (PDT)</w:t>
+        <w:t xml:space="preserve">Last modified: 2026-10-22 16:14:37 (PDT)</w:t>
       </w:r>
     </w:p>
-    <w:bookmarkStart w:id="14" w:name="welcome"/>
+    <w:bookmarkStart w:id="15" w:name="welcome"/>
     <w:p>
       <w:pPr>
         <w:pStyle w:val="Heading1"/>
@@ -47,7 +47,7 @@
         <w:t xml:space="preserve">The code runs when the site is built, so every figure comes from the data shown.</w:t>
       </w:r>
     </w:p>
-    <w:bookmarkStart w:id="10" w:name="pages"/>
+    <w:bookmarkStart w:id="11" w:name="pages"/>
     <w:p>
       <w:pPr>
         <w:pStyle w:val="Heading2"/>
@@ -76,8 +76,28 @@
         <w:t xml:space="preserve">: a rug and two histograms for a 0/1 outcome and a continuous feature.</w:t>
       </w:r>
     </w:p>
-    <w:bookmarkEnd w:id="10"/>
-    <w:bookmarkStart w:id="11" w:name="formats"/>
+    <w:p>
+      <w:pPr>
+        <w:pStyle w:val="Compact"/>
+        <w:numPr>
+          <w:ilvl w:val="0"/>
+          <w:numId w:val="1001"/>
+        </w:numPr>
+      </w:pPr>
+      <w:hyperlink r:id="rId10">
+        <w:r>
+          <w:rPr>
+            <w:rStyle w:val="Hyperlink"/>
+          </w:rPr>
+          <w:t xml:space="preserve">Choosing Colors</w:t>
+        </w:r>
+      </w:hyperlink>
+      <w:r>
+        <w:t xml:space="preserve">: how far apart a palette’s closest two colors are under simulated color vision deficiency.</w:t>
+      </w:r>
+    </w:p>
+    <w:bookmarkEnd w:id="11"/>
+    <w:bookmarkStart w:id="12" w:name="formats"/>
     <w:p>
       <w:pPr>
         <w:pStyle w:val="Heading2"/>
@@ -145,8 +165,8 @@
         <w:t xml:space="preserve">a PDF handout and a Word document.</w:t>
       </w:r>
     </w:p>
-    <w:bookmarkEnd w:id="11"/>
-    <w:bookmarkStart w:id="13" w:name="references"/>
+    <w:bookmarkEnd w:id="12"/>
+    <w:bookmarkStart w:id="14" w:name="references"/>
     <w:p>
       <w:pPr>
         <w:pStyle w:val="Heading2"/>
@@ -155,10 +175,10 @@
         <w:t xml:space="preserve">References</w:t>
       </w:r>
     </w:p>
-    <w:bookmarkStart w:id="12" w:name="refs"/>
-    <w:bookmarkEnd w:id="12"/>
+    <w:bookmarkStart w:id="13" w:name="refs"/>
     <w:bookmarkEnd w:id="13"/>
     <w:bookmarkEnd w:id="14"/>
+    <w:bookmarkEnd w:id="15"/>
     <w:sectPr>
       <w:footnotePr>
         <w:numRestart w:val="eachSect"/>

</xml_diff>